<commit_message>
Añado filtros, edicion y motivos de correo
</commit_message>
<xml_diff>
--- a/Automatizacion_Facturas_MIGASA.docx
+++ b/Automatizacion_Facturas_MIGASA.docx
@@ -525,6 +525,65 @@
           </w:p>
         </w:tc>
       </w:tr>
+      <w:tr>
+        <w:tc>
+          <w:tcPr>
+            <w:tcW w:w="1417" w:type="dxa"/>
+            <w:tcBorders>
+              <w:top w:val="single" w:sz="4" w:space="0" w:color="000000"/>
+              <w:left w:val="single" w:sz="4" w:space="0" w:color="000000"/>
+              <w:bottom w:val="single" w:sz="4" w:space="0" w:color="000000"/>
+              <w:right w:val="single" w:sz="4" w:space="0" w:color="000000"/>
+            </w:tcBorders>
+            <w:vAlign w:val="center"/>
+          </w:tcPr>
+          <w:p>
+            <w:pPr>
+              <w:jc w:val="center"/>
+            </w:pPr>
+            <w:r>
+              <w:t>2</w:t>
+            </w:r>
+          </w:p>
+        </w:tc>
+        <w:tc>
+          <w:tcPr>
+            <w:tcW w:w="2268" w:type="dxa"/>
+            <w:tcBorders>
+              <w:top w:val="single" w:sz="4" w:space="0" w:color="000000"/>
+              <w:left w:val="single" w:sz="4" w:space="0" w:color="000000"/>
+              <w:bottom w:val="single" w:sz="4" w:space="0" w:color="000000"/>
+              <w:right w:val="single" w:sz="4" w:space="0" w:color="000000"/>
+            </w:tcBorders>
+            <w:vAlign w:val="center"/>
+          </w:tcPr>
+          <w:p>
+            <w:pPr>
+              <w:jc w:val="center"/>
+            </w:pPr>
+            <w:r>
+              <w:t>06/07/2026</w:t>
+            </w:r>
+          </w:p>
+        </w:tc>
+        <w:tc>
+          <w:tcPr>
+            <w:tcW w:w="4819" w:type="dxa"/>
+            <w:tcBorders>
+              <w:top w:val="single" w:sz="4" w:space="0" w:color="000000"/>
+              <w:left w:val="single" w:sz="4" w:space="0" w:color="000000"/>
+              <w:bottom w:val="single" w:sz="4" w:space="0" w:color="000000"/>
+              <w:right w:val="single" w:sz="4" w:space="0" w:color="000000"/>
+            </w:tcBorders>
+            <w:vAlign w:val="center"/>
+          </w:tcPr>
+          <w:p>
+            <w:r>
+              <w:t>Unificación de app_auto y app_manual en una sola aplicación; ampliación de la detección de documentos que no son factura; historial completo; papelera y visor de PDF en corrección manual.</w:t>
+            </w:r>
+          </w:p>
+        </w:tc>
+      </w:tr>
     </w:tbl>
     <w:p>
       <w:r>
@@ -1559,7 +1618,7 @@
           <w:rFonts w:ascii="Arial" w:hAnsi="Arial"/>
           <w:sz w:val="20"/>
         </w:rPr>
-        <w:t>Grupo MIGASA ha automatizado el circuito de recepción, extracción y validación de datos de facturas de proveedor mediante la combinación de tres componentes: un flujo de Power Automate que captura y redistribuye los documentos, una aplicación de extracción automática (app_auto) que interpreta el contenido de cada factura mediante inteligencia artificial, y una aplicación de revisión manual (app_manual) donde una persona completa o corrige los casos que no se han podido resolver de forma automática. Este documento describe el funcionamiento de cada uno de estos componentes y cómo se relacionan entre sí.</w:t>
+        <w:t>Grupo MIGASA ha automatizado el circuito de recepción, extracción y validación de datos de facturas de proveedor mediante la combinación de dos componentes: un flujo de Power Automate que captura y redistribuye los documentos recibidos por correo, y una única aplicación web que interpreta el contenido de cada factura mediante inteligencia artificial, la clasifica, y permite revisar y corregir manualmente los casos que no se han podido resolver de forma automática. Esta aplicación ofrece tres vistas sobre una misma base de código y un mismo historial: “Visualización automática” (procesamiento y clasificación desatendidos), “Corregir manualmente” (revisión y corrección de los casos pendientes) y “Subir facturas” (incorporación puntual de una factura a la cola de corrección). Este documento describe el funcionamiento de cada una de estas partes y cómo se relacionan entre sí.</w:t>
       </w:r>
     </w:p>
     <w:p>
@@ -1676,7 +1735,7 @@
           <w:rFonts w:ascii="Arial" w:hAnsi="Arial"/>
           <w:sz w:val="20"/>
         </w:rPr>
-        <w:t>Cuando app_auto extrae correctamente todos los campos obligatorios de una factura salvo el número de pedido de cliente (PedidoCliente), la clasifica en la carpeta falta_pedidocliente en lugar de darla por cerrada. Un segundo flujo de Power Automate vigila esa carpeta y, en cuanto detecta un fichero nuevo, recupera el nombre original del archivo y el correo electrónico del remitente a partir del nombre renombrado (marcadores __EMAIL__ / __ENDMAIL__), y envía automáticamente un correo de vuelta a ese remitente solicitando que reenvíe la factura corregida con el número de pedido incluido.</w:t>
+        <w:t>Cuando la aplicación extrae correctamente todos los campos obligatorios de una factura salvo el número de pedido de cliente (PedidoCliente), la clasifica en la carpeta reenviar_falta_pedidocliente en lugar de darla por cerrada. Un segundo flujo de Power Automate vigila esa carpeta y, en cuanto detecta un fichero nuevo, recupera el nombre original del archivo y el correo electrónico del remitente a partir del nombre renombrado (marcadores __EMAIL__ / __ENDMAIL__), y envía automáticamente un correo de vuelta a ese remitente solicitando que reenvíe la factura corregida con el número de pedido incluido.</w:t>
       </w:r>
     </w:p>
     <w:p>
@@ -1694,8 +1753,7 @@
           <w:color w:val="4A7C2F"/>
           <w:sz w:val="22"/>
         </w:rPr>
-        <w:lastRenderedPageBreak/>
-        <w:t>3. APP_AUTO – EXTRACCIÓN AUTOMÁTICA</w:t>
+        <w:t>3. PROCESAMIENTO AUTOMÁTICO (VISTA “VISUALIZACIÓN AUTOMÁTICA”)</w:t>
       </w:r>
       <w:bookmarkEnd w:id="5"/>
     </w:p>
@@ -1709,7 +1767,7 @@
           <w:rFonts w:ascii="Arial" w:hAnsi="Arial"/>
           <w:sz w:val="20"/>
         </w:rPr>
-        <w:t>app_auto es el componente encargado de la extracción de datos sin intervención humana y de la clasificación inicial de cada factura recibida.</w:t>
+        <w:t>Esta vista corresponde al procesamiento desatendido de facturas: la extracción de datos sin intervención humana y la clasificación inicial de cada factura recibida, tanto las llegadas vía Power Automate como las depositadas por la vigilancia periódica de la carpeta de entrada.</w:t>
       </w:r>
     </w:p>
     <w:p>
@@ -1791,7 +1849,7 @@
           <w:rFonts w:ascii="Arial" w:hAnsi="Arial"/>
           <w:sz w:val="20"/>
         </w:rPr>
-        <w:t>app_auto revisa periódicamente la carpeta de entrada y, para cada PDF, comprueba primero si se trata de un albarán; si lo detecta, lo clasifica directamente en la carpeta albaran, ya que estos documentos se gestionan por defecto sin necesidad de extracción de datos de factura. En caso contrario, analiza el documento mediante un modelo de inteligencia artificial (OpenAI) que extrae los campos definidos (proveedor, comprador, importes, IVA, número de factura, número de pedido de cliente, entre otros) y clasifica la factura en una de las siguientes carpetas según el resultado:</w:t>
+        <w:t>Para cada PDF de la carpeta de entrada, la aplicación comprueba primero si el documento no es una factura: además de los albaranes de entrega clásicos, esta comprobación detecta también tickets de báscula o pesaje, documentos de transporte (CMR / carta de porte, en varios idiomas) y partes de horas o de actividad. Si el documento se identifica como “no factura”, se clasifica directamente en la carpeta no_es_factura, sin necesidad de extracción de datos de factura. En caso contrario, analiza el documento mediante un modelo de inteligencia artificial (OpenAI) que extrae los campos definidos (proveedor, comprador, importes, IVA, número de factura, número de pedido de cliente, entre otros) y clasifica la factura en una de las siguientes carpetas según el resultado:</w:t>
       </w:r>
     </w:p>
     <w:p>
@@ -1843,7 +1901,7 @@
           <w:rFonts w:ascii="Arial" w:hAnsi="Arial"/>
           <w:sz w:val="20"/>
         </w:rPr>
-        <w:t>falta_pedidocliente – todos los campos obligatorios son correctos salvo el número de pedido de cliente; dispara el segundo flujo de Power Automate (apartado 2.3).</w:t>
+        <w:t>reenviar_falta_pedidocliente – todos los campos obligatorios son correctos salvo el número de pedido de cliente; dispara el segundo flujo de Power Automate (apartado 2.3).</w:t>
       </w:r>
     </w:p>
     <w:p>
@@ -1884,7 +1942,7 @@
           <w:rFonts w:ascii="Arial" w:hAnsi="Arial"/>
           <w:sz w:val="20"/>
         </w:rPr>
-        <w:t>app_auto incorpora un proceso de vigilancia que revisa cada 30 segundos la carpeta de entrada y procesa automáticamente cualquier PDF nuevo depositado por Power Automate, sin necesidad de que un usuario lo suba manualmente.</w:t>
+        <w:t>La aplicación incorpora un proceso de vigilancia que revisa cada 30 segundos (configurable) la carpeta de entrada y procesa automáticamente cualquier PDF nuevo depositado por Power Automate, sin necesidad de que un usuario lo suba manualmente.</w:t>
       </w:r>
     </w:p>
     <w:p>
@@ -1902,8 +1960,7 @@
           <w:color w:val="4A7C2F"/>
           <w:sz w:val="22"/>
         </w:rPr>
-        <w:lastRenderedPageBreak/>
-        <w:t>4. APP_MANUAL – REVISIÓN Y CORRECCIÓN</w:t>
+        <w:t>4. CORRECCIÓN MANUAL Y SUBIDA DE FACTURAS (VISTAS “CORREGIR MANUALMENTE” Y “SUBIR FACTURAS”)</w:t>
       </w:r>
       <w:bookmarkEnd w:id="9"/>
     </w:p>
@@ -1917,7 +1974,7 @@
           <w:rFonts w:ascii="Arial" w:hAnsi="Arial"/>
           <w:sz w:val="20"/>
         </w:rPr>
-        <w:t>app_manual es la aplicación donde una persona revisa y completa las facturas que app_auto no ha podido resolver por sí sola, es decir, las que han quedado en la carpeta corregir_manualmente por faltar algún campo obligatorio (distinto del número de pedido de cliente, que se gestiona mediante el flujo de Power Automate del apartado 2.3).</w:t>
+        <w:t>Estas vistas son donde una persona revisa y completa las facturas que el procesamiento automático no ha podido resolver por sí solo, es decir, las que han quedado en la carpeta corregir_manualmente por faltar algún campo obligatorio (distinto del número de pedido de cliente, que se gestiona mediante el flujo de Power Automate del apartado 2.3), y donde también se pueden subir facturas sueltas directamente a esa misma cola.</w:t>
       </w:r>
     </w:p>
     <w:p>
@@ -1954,11 +2011,20 @@
         <w:spacing w:after="120" w:line="360" w:lineRule="auto"/>
       </w:pPr>
       <w:r>
+        <w:t>POST /subir-factura – sube un PDF directamente a la cola de corrección manual; permite marcarlo como “urgente” para que aparezca el primero en la lista de pendientes.</w:t>
+      </w:r>
+    </w:p>
+    <w:p>
+      <w:pPr>
+        <w:pStyle w:val="Listaconvietas"/>
+        <w:spacing w:after="120" w:line="360" w:lineRule="auto"/>
+      </w:pPr>
+      <w:r>
         <w:rPr>
           <w:rFonts w:ascii="Arial" w:hAnsi="Arial"/>
           <w:sz w:val="20"/>
         </w:rPr>
-        <w:t>POST /extraer-pendiente – carga un PDF concreto, reutilizando los datos ya extraídos en el histórico si existen, para no volver a llamar a la IA.</w:t>
+        <w:t>POST /extraer-pendiente – carga un PDF concreto, reutilizando los datos ya extraídos en el historial si existen para no volver a llamar a la IA; si el documento no parece una factura, lo indica directamente sin necesidad de extraerlo.</w:t>
       </w:r>
     </w:p>
     <w:p>
@@ -1972,6 +2038,24 @@
           <w:sz w:val="20"/>
         </w:rPr>
         <w:t>POST /confirmar-factura – guarda la corrección manual en facturas_corregidas.xlsx y traslada el PDF a examinadas.</w:t>
+      </w:r>
+    </w:p>
+    <w:p>
+      <w:pPr>
+        <w:pStyle w:val="Listaconvietas"/>
+        <w:spacing w:after="120" w:line="360" w:lineRule="auto"/>
+      </w:pPr>
+      <w:r>
+        <w:t>POST /descartar-pendiente – “papelera”: traslada un PDF de corregir_manualmente a no_es_factura sin borrarlo, para cuando la clasificación automática ha metido en la cola de corrección un documento que en realidad no es una factura.</w:t>
+      </w:r>
+    </w:p>
+    <w:p>
+      <w:pPr>
+        <w:pStyle w:val="Listaconvietas"/>
+        <w:spacing w:after="120" w:line="360" w:lineRule="auto"/>
+      </w:pPr>
+      <w:r>
+        <w:t>GET /pdf-pendiente/{archivo} – sirve el PDF de un pendiente para poder abrirlo y revisarlo directamente desde el navegador, sin necesidad de buscarlo manualmente en la carpeta compartida.</w:t>
       </w:r>
     </w:p>
     <w:p>
@@ -2012,7 +2096,7 @@
           <w:rFonts w:ascii="Arial" w:hAnsi="Arial"/>
           <w:sz w:val="20"/>
         </w:rPr>
-        <w:t>El usuario visualiza en una tabla editable los datos ya extraídos de cada factura pendiente y corrige o completa los campos que falten. Al confirmar, la factura pasa a la carpeta de examinadas y el histórico diario (historial_facturas_usuario_YYYY-MM-DD.xlsx) se actualiza con la corrección realizada.</w:t>
+        <w:t>El usuario visualiza en una tabla editable los datos ya extraídos de cada factura pendiente, puede abrir el PDF original directamente desde el navegador para consultarlo sin buscarlo en la carpeta compartida, y corrige o completa los campos que falten. Si el documento resulta no ser una factura, puede apartarlo con un clic a la carpeta no_es_factura sin necesidad de borrarlo. Al confirmar, la factura pasa a la carpeta de examinadas y el historial completo (véase apartado 5) se actualiza con la corrección realizada. Desde la vista “Subir facturas” se puede además incorporar una factura suelta a esta misma cola, marcándola como urgente si necesita revisión prioritaria.</w:t>
       </w:r>
     </w:p>
     <w:p>
@@ -2045,7 +2129,7 @@
           <w:rFonts w:ascii="Arial" w:hAnsi="Arial"/>
           <w:sz w:val="20"/>
         </w:rPr>
-        <w:t>Tanto app_auto como app_manual registran cada extracción y cada corrección en ficheros de histórico en Excel (historial_facturas_*.xlsx y facturas_corregidas.xlsx), de forma que queda constancia de todas las facturas procesadas, tanto las resueltas automáticamente como las corregidas manualmente. Este histórico está pensado para poder subir posteriormente su contenido a Dynamics, de manera que las facturas queden también registradas en dicho sistema.</w:t>
+        <w:t>La aplicación registra cada extracción automática, cada resultado de la segunda pasada con visión y cada corrección manual en ficheros de historial en Excel (historial_facturas_auto.xlsx, historial_facturas_imagenes.xlsx y facturas_corregidas.xlsx). La vista de “Historial completo” combina estos tres orígenes en una sola tabla, consultable desde el navegador y descargable en Excel, dando prioridad a la corrección manual cuando una misma factura aparece en más de uno. Este historial está pensado para poder subir posteriormente su contenido a Dynamics, de manera que las facturas queden también registradas en dicho sistema.</w:t>
       </w:r>
     </w:p>
     <w:p>
@@ -2078,7 +2162,7 @@
           <w:rFonts w:ascii="Arial" w:hAnsi="Arial"/>
           <w:sz w:val="20"/>
         </w:rPr>
-        <w:t>La combinación de Power Automate, app_auto y app_manual conforma un circuito completo de tratamiento de facturas: Power Automate captura, renombra y redistribuye los documentos recibidos por correo, y gestiona la solicitud de corrección cuando falta el número de pedido de cliente; app_auto asume la extracción automática y la clasificación inicial mediante IA; y app_manual cierra el proceso permitiendo revisar y corregir manualmente los demás casos que no se han podido completar de forma automática. El histórico resultante permite además trasladar posteriormente las facturas a Dynamics. El resultado es una reducción significativa del trabajo manual, reservando la intervención de las personas a los casos que realmente lo requieren.</w:t>
+        <w:t>La combinación de Power Automate y la aplicación de extracción conforma un circuito completo de tratamiento de facturas: Power Automate captura, renombra y redistribuye los documentos recibidos por correo, y gestiona la solicitud de corrección cuando falta el número de pedido de cliente; la aplicación asume la extracción automática y la clasificación inicial mediante IA, con una detección cada vez más precisa de los documentos que no son factura (albaranes, tickets de báscula, documentos de transporte, partes de horas...), y permite revisar, corregir o descartar manualmente los demás casos que no se han podido completar de forma automática, sin perder nunca el documento original. El historial completo resultante permite además trasladar posteriormente las facturas a Dynamics. El resultado es una reducción significativa del trabajo manual, reservando la intervención de las personas a los casos que realmente lo requieren.</w:t>
       </w:r>
     </w:p>
     <w:sectPr>

</xml_diff>

<commit_message>
Persistencia de facturas en SQL Server y carga de proveedores clasificados
- Amplia PedidoCliente a NVARCHAR(1000) en FacturasExaminadas (pedidos concatenados)
- Migra tambien historial_facturas_imagenes.xlsx en migrar_historial_excel.py
- Nuevo cargar_proveedores.py: carga ProveedoresBC(.Envasado).xls a la tabla ProveedoresClasificados (CIF, nombre, Granel/Envasado, bloqueado)
- Documentacion actualizada (README y Word)
</commit_message>
<xml_diff>
--- a/Automatizacion_Facturas_MIGASA.docx
+++ b/Automatizacion_Facturas_MIGASA.docx
@@ -584,6 +584,38 @@
           </w:p>
         </w:tc>
       </w:tr>
+      <w:tr>
+        <w:tc>
+          <w:tcPr>
+            <w:tcW w:type="dxa" w:w="1417"/>
+          </w:tcPr>
+          <w:p>
+            <w:r>
+              <w:t>3</w:t>
+            </w:r>
+          </w:p>
+        </w:tc>
+        <w:tc>
+          <w:tcPr>
+            <w:tcW w:type="dxa" w:w="2268"/>
+          </w:tcPr>
+          <w:p>
+            <w:r>
+              <w:t>08/07/2026</w:t>
+            </w:r>
+          </w:p>
+        </w:tc>
+        <w:tc>
+          <w:tcPr>
+            <w:tcW w:type="dxa" w:w="4819"/>
+          </w:tcPr>
+          <w:p>
+            <w:r>
+              <w:t>Persistencia de facturas completadas en SQL Server (tabla FacturasExaminadas), migración del histórico Excel acumulado, y nueva tabla de proveedores clasificados por Granel/Envasado (ProveedoresClasificados).</w:t>
+            </w:r>
+          </w:p>
+        </w:tc>
+      </w:tr>
     </w:tbl>
     <w:p>
       <w:r>
@@ -2133,6 +2165,50 @@
       </w:r>
     </w:p>
     <w:p>
+      <w:pPr/>
+      <w:r>
+        <w:t>Desde julio de 2026, además del histórico en Excel, cada factura completada (extracción automática, segunda pasada con visión o corrección manual) se guarda también, de forma automática y como complemento del histórico Excel, en una base de datos SQL Server (tabla FacturasExaminadas), con upsert por nombre de archivo para evitar duplicados. Un fallo de conexión con la base de datos no interrumpe el procesamiento de facturas ni el guardado del histórico Excel, del que este guardado en SQL Server es un complemento. El histórico acumulado antes de contar con acceso a la base de datos corporativa se volcó a la tabla mediante un script de migración puntual (migrar_historial_excel.py), seguro de repetir por el mismo mecanismo de upsert. Esta persistencia en SQL Server sienta la base para la futura integración con Dynamics.</w:t>
+      </w:r>
+    </w:p>
+    <w:p>
+      <w:pPr>
+        <w:pStyle w:val="Ttulo1"/>
+      </w:pPr>
+      <w:r>
+        <w:t>6. PROVEEDORES CLASIFICADOS (GRANEL / ENVASADO)</w:t>
+      </w:r>
+    </w:p>
+    <w:p>
+      <w:pPr/>
+      <w:r>
+        <w:t>Al margen del circuito de facturas, la misma base de datos aloja una tabla adicional, ProveedoresClasificados, con el listado de proveedores de Grupo MIGASA clasificados según el tipo de producto que suministran (Granel o Envasado), su CIF, el nombre de la empresa y si están o no bloqueados. Esta tabla se carga a partir de los ficheros ProveedoresBC.xls (Granel) y ProveedoresBCEnvasado.xls (Envasado), exportados desde Business Central.</w:t>
+      </w:r>
+    </w:p>
+    <w:p>
+      <w:pPr>
+        <w:pStyle w:val="Listaconvietas"/>
+      </w:pPr>
+      <w:r>
+        <w:t>cargar_proveedores.py — script puntual que lee ambos ficheros Excel y guarda cada proveedor en la tabla ProveedoresClasificados, marcándolo con su clasificación de origen (Granel o Envasado).</w:t>
+      </w:r>
+    </w:p>
+    <w:p>
+      <w:pPr>
+        <w:pStyle w:val="Listaconvietas"/>
+      </w:pPr>
+      <w:r>
+        <w:t>Un mismo CIF puede aparecer en los dos ficheros de origen cuando el proveedor suministra tanto a granel como envasado; en ese caso se guarda una fila por cada clasificación, sin perder ninguna de las dos.</w:t>
+      </w:r>
+    </w:p>
+    <w:p>
+      <w:pPr>
+        <w:pStyle w:val="Listaconvietas"/>
+      </w:pPr>
+      <w:r>
+        <w:t>La carga se guarda por upsert sobre la combinación CIF + Clasificación, por lo que el script es seguro de volver a ejecutar cada vez que se reciban ficheros actualizados de proveedores.</w:t>
+      </w:r>
+    </w:p>
+    <w:p>
       <w:pPr>
         <w:pStyle w:val="Ttulo1"/>
         <w:pageBreakBefore/>
@@ -2147,8 +2223,7 @@
           <w:color w:val="4A7C2F"/>
           <w:sz w:val="22"/>
         </w:rPr>
-        <w:lastRenderedPageBreak/>
-        <w:t>6. CONCLUSIONES</w:t>
+        <w:t>7. CONCLUSIONES</w:t>
       </w:r>
       <w:bookmarkEnd w:id="13"/>
     </w:p>

</xml_diff>